<commit_message>
Adding 2 other classifiers
Adding Decision Tree classifier and Logistic Regression to the experiments.
</commit_message>
<xml_diff>
--- a/RELATORIO_ADULTS.docx
+++ b/RELATORIO_ADULTS.docx
@@ -39,12 +39,14 @@
       <w:r>
         <w:t xml:space="preserve">Usando o método </w:t>
       </w:r>
+      <w:proofErr w:type="spellStart"/>
       <w:r>
         <w:rPr>
           <w:color w:val="0F9ED5" w:themeColor="accent4"/>
         </w:rPr>
         <w:t>describe</w:t>
       </w:r>
+      <w:proofErr w:type="spellEnd"/>
       <w:r>
         <w:rPr>
           <w:color w:val="0D0D0D" w:themeColor="text1" w:themeTint="F2"/>
@@ -244,11 +246,33 @@
           <w:color w:val="0D0D0D" w:themeColor="text1" w:themeTint="F2"/>
         </w:rPr>
       </w:pPr>
-      <w:r>
-        <w:rPr>
-          <w:color w:val="0D0D0D" w:themeColor="text1" w:themeTint="F2"/>
-        </w:rPr>
-        <w:t>Name: age, dtype: float64</w:t>
+      <w:proofErr w:type="spellStart"/>
+      <w:r>
+        <w:rPr>
+          <w:color w:val="0D0D0D" w:themeColor="text1" w:themeTint="F2"/>
+        </w:rPr>
+        <w:t>Name</w:t>
+      </w:r>
+      <w:proofErr w:type="spellEnd"/>
+      <w:r>
+        <w:rPr>
+          <w:color w:val="0D0D0D" w:themeColor="text1" w:themeTint="F2"/>
+        </w:rPr>
+        <w:t xml:space="preserve">: age, </w:t>
+      </w:r>
+      <w:proofErr w:type="spellStart"/>
+      <w:r>
+        <w:rPr>
+          <w:color w:val="0D0D0D" w:themeColor="text1" w:themeTint="F2"/>
+        </w:rPr>
+        <w:t>dtype</w:t>
+      </w:r>
+      <w:proofErr w:type="spellEnd"/>
+      <w:r>
+        <w:rPr>
+          <w:color w:val="0D0D0D" w:themeColor="text1" w:themeTint="F2"/>
+        </w:rPr>
+        <w:t>: float64</w:t>
       </w:r>
     </w:p>
     <w:p>
@@ -261,19 +285,7 @@
         <w:rPr>
           <w:color w:val="0D0D0D" w:themeColor="text1" w:themeTint="F2"/>
         </w:rPr>
-        <w:t xml:space="preserve"># 16% </w:t>
-      </w:r>
-      <w:r>
-        <w:rPr>
-          <w:color w:val="0D0D0D" w:themeColor="text1" w:themeTint="F2"/>
-        </w:rPr>
-        <w:t>das pessoas até 40 anos</w:t>
-      </w:r>
-      <w:r>
-        <w:rPr>
-          <w:color w:val="0D0D0D" w:themeColor="text1" w:themeTint="F2"/>
-        </w:rPr>
-        <w:t xml:space="preserve"> </w:t>
+        <w:t xml:space="preserve"># 16% das pessoas até 40 anos </w:t>
       </w:r>
       <w:r>
         <w:rPr>
@@ -346,13 +358,7 @@
         <w:rPr>
           <w:color w:val="0D0D0D" w:themeColor="text1" w:themeTint="F2"/>
         </w:rPr>
-        <w:t xml:space="preserve"> anos </w:t>
-      </w:r>
-      <w:r>
-        <w:rPr>
-          <w:color w:val="0D0D0D" w:themeColor="text1" w:themeTint="F2"/>
-        </w:rPr>
-        <w:t>ganham mais qu</w:t>
+        <w:t xml:space="preserve"> anos ganham mais qu</w:t>
       </w:r>
       <w:r>
         <w:rPr>
@@ -487,6 +493,7 @@
       </w:pPr>
       <w:r>
         <w:rPr>
+          <w:noProof/>
           <w:color w:val="0D0D0D" w:themeColor="text1" w:themeTint="F2"/>
         </w:rPr>
         <w:drawing>
@@ -538,7 +545,21 @@
           <w:color w:val="0D0D0D" w:themeColor="text1" w:themeTint="F2"/>
         </w:rPr>
         <w:lastRenderedPageBreak/>
-        <w:t xml:space="preserve">Como foi pedido o uso de KNN para o exercício o método de normalização usado para a coluna de age foi o min-max seguindo </w:t>
+        <w:t>Como foi pedido o uso de KNN para o exercício o método de normalização usado para a coluna de age foi o min-</w:t>
+      </w:r>
+      <w:proofErr w:type="spellStart"/>
+      <w:r>
+        <w:rPr>
+          <w:color w:val="0D0D0D" w:themeColor="text1" w:themeTint="F2"/>
+        </w:rPr>
+        <w:t>max</w:t>
+      </w:r>
+      <w:proofErr w:type="spellEnd"/>
+      <w:r>
+        <w:rPr>
+          <w:color w:val="0D0D0D" w:themeColor="text1" w:themeTint="F2"/>
+        </w:rPr>
+        <w:t xml:space="preserve"> seguindo </w:t>
       </w:r>
       <w:hyperlink r:id="rId6" w:history="1">
         <w:r>
@@ -563,20 +584,30 @@
           <w:szCs w:val="36"/>
         </w:rPr>
       </w:pPr>
+      <w:proofErr w:type="spellStart"/>
       <w:r>
         <w:rPr>
           <w:color w:val="0D0D0D" w:themeColor="text1" w:themeTint="F2"/>
           <w:sz w:val="36"/>
           <w:szCs w:val="36"/>
         </w:rPr>
-        <w:t>Native c</w:t>
-      </w:r>
+        <w:t>Native</w:t>
+      </w:r>
+      <w:proofErr w:type="spellEnd"/>
       <w:r>
         <w:rPr>
           <w:color w:val="0D0D0D" w:themeColor="text1" w:themeTint="F2"/>
           <w:sz w:val="36"/>
           <w:szCs w:val="36"/>
         </w:rPr>
+        <w:t xml:space="preserve"> c</w:t>
+      </w:r>
+      <w:r>
+        <w:rPr>
+          <w:color w:val="0D0D0D" w:themeColor="text1" w:themeTint="F2"/>
+          <w:sz w:val="36"/>
+          <w:szCs w:val="36"/>
+        </w:rPr>
         <w:t>ountry</w:t>
       </w:r>
     </w:p>
@@ -603,6 +634,7 @@
       </w:pPr>
       <w:r>
         <w:rPr>
+          <w:noProof/>
           <w:color w:val="0D0D0D" w:themeColor="text1" w:themeTint="F2"/>
         </w:rPr>
         <w:drawing>
@@ -658,10 +690,240 @@
     </w:p>
     <w:p>
       <w:pPr>
-        <w:rPr>
-          <w:color w:val="0D0D0D" w:themeColor="text1" w:themeTint="F2"/>
-        </w:rPr>
-      </w:pPr>
+        <w:pStyle w:val="PargrafodaLista"/>
+        <w:numPr>
+          <w:ilvl w:val="0"/>
+          <w:numId w:val="1"/>
+        </w:numPr>
+        <w:rPr>
+          <w:color w:val="0D0D0D" w:themeColor="text1" w:themeTint="F2"/>
+          <w:sz w:val="36"/>
+          <w:szCs w:val="36"/>
+        </w:rPr>
+      </w:pPr>
+      <w:proofErr w:type="spellStart"/>
+      <w:r>
+        <w:rPr>
+          <w:color w:val="0D0D0D" w:themeColor="text1" w:themeTint="F2"/>
+          <w:sz w:val="36"/>
+          <w:szCs w:val="36"/>
+        </w:rPr>
+        <w:t>Education</w:t>
+      </w:r>
+      <w:proofErr w:type="spellEnd"/>
+      <w:r>
+        <w:rPr>
+          <w:color w:val="0D0D0D" w:themeColor="text1" w:themeTint="F2"/>
+          <w:sz w:val="36"/>
+          <w:szCs w:val="36"/>
+        </w:rPr>
+        <w:t xml:space="preserve"> Num</w:t>
+      </w:r>
+    </w:p>
+    <w:p>
+      <w:pPr>
+        <w:rPr>
+          <w:color w:val="0D0D0D" w:themeColor="text1" w:themeTint="F2"/>
+        </w:rPr>
+      </w:pPr>
+      <w:r>
+        <w:rPr>
+          <w:color w:val="0D0D0D" w:themeColor="text1" w:themeTint="F2"/>
+        </w:rPr>
+        <w:t>A variável `</w:t>
+      </w:r>
+      <w:proofErr w:type="spellStart"/>
+      <w:r>
+        <w:rPr>
+          <w:color w:val="0D0D0D" w:themeColor="text1" w:themeTint="F2"/>
+        </w:rPr>
+        <w:t>education</w:t>
+      </w:r>
+      <w:proofErr w:type="spellEnd"/>
+      <w:r>
+        <w:rPr>
+          <w:color w:val="0D0D0D" w:themeColor="text1" w:themeTint="F2"/>
+        </w:rPr>
+        <w:t>` foi excluída em favor da variável `</w:t>
+      </w:r>
+      <w:proofErr w:type="spellStart"/>
+      <w:r>
+        <w:rPr>
+          <w:color w:val="0D0D0D" w:themeColor="text1" w:themeTint="F2"/>
+        </w:rPr>
+        <w:t>education</w:t>
+      </w:r>
+      <w:proofErr w:type="spellEnd"/>
+      <w:r>
+        <w:rPr>
+          <w:color w:val="0D0D0D" w:themeColor="text1" w:themeTint="F2"/>
+        </w:rPr>
+        <w:t xml:space="preserve">-num`, olhando a distribuição dessa, as categorias mais expressivas </w:t>
+      </w:r>
+      <w:r>
+        <w:rPr>
+          <w:color w:val="0D0D0D" w:themeColor="text1" w:themeTint="F2"/>
+        </w:rPr>
+        <w:t>são “HS-</w:t>
+      </w:r>
+      <w:proofErr w:type="spellStart"/>
+      <w:r>
+        <w:rPr>
+          <w:color w:val="0D0D0D" w:themeColor="text1" w:themeTint="F2"/>
+        </w:rPr>
+        <w:t>grad</w:t>
+      </w:r>
+      <w:proofErr w:type="spellEnd"/>
+      <w:r>
+        <w:rPr>
+          <w:color w:val="0D0D0D" w:themeColor="text1" w:themeTint="F2"/>
+        </w:rPr>
+        <w:t>”, “Some-</w:t>
+      </w:r>
+      <w:proofErr w:type="spellStart"/>
+      <w:r>
+        <w:rPr>
+          <w:color w:val="0D0D0D" w:themeColor="text1" w:themeTint="F2"/>
+        </w:rPr>
+        <w:t>College</w:t>
+      </w:r>
+      <w:proofErr w:type="spellEnd"/>
+      <w:r>
+        <w:rPr>
+          <w:color w:val="0D0D0D" w:themeColor="text1" w:themeTint="F2"/>
+        </w:rPr>
+        <w:t>”, e “</w:t>
+      </w:r>
+      <w:proofErr w:type="spellStart"/>
+      <w:r>
+        <w:rPr>
+          <w:color w:val="0D0D0D" w:themeColor="text1" w:themeTint="F2"/>
+        </w:rPr>
+        <w:t>Bachelors</w:t>
+      </w:r>
+      <w:proofErr w:type="spellEnd"/>
+      <w:r>
+        <w:rPr>
+          <w:color w:val="0D0D0D" w:themeColor="text1" w:themeTint="F2"/>
+        </w:rPr>
+        <w:t>”, nessa ordem, a categoria “</w:t>
+      </w:r>
+      <w:proofErr w:type="spellStart"/>
+      <w:r>
+        <w:rPr>
+          <w:color w:val="0D0D0D" w:themeColor="text1" w:themeTint="F2"/>
+        </w:rPr>
+        <w:t>Bachelors</w:t>
+      </w:r>
+      <w:proofErr w:type="spellEnd"/>
+      <w:r>
+        <w:rPr>
+          <w:color w:val="0D0D0D" w:themeColor="text1" w:themeTint="F2"/>
+        </w:rPr>
+        <w:t xml:space="preserve">” representa o maior balanceamento entre “&lt;= 50k” e “&gt; 50k”, </w:t>
+      </w:r>
+    </w:p>
+    <w:p>
+      <w:pPr>
+        <w:rPr>
+          <w:color w:val="0D0D0D" w:themeColor="text1" w:themeTint="F2"/>
+        </w:rPr>
+      </w:pPr>
+    </w:p>
+    <w:p>
+      <w:pPr>
+        <w:rPr>
+          <w:color w:val="0D0D0D" w:themeColor="text1" w:themeTint="F2"/>
+        </w:rPr>
+      </w:pPr>
+      <w:r>
+        <w:rPr>
+          <w:color w:val="0D0D0D" w:themeColor="text1" w:themeTint="F2"/>
+        </w:rPr>
+        <w:lastRenderedPageBreak/>
+        <w:drawing>
+          <wp:inline distT="0" distB="0" distL="0" distR="0" wp14:anchorId="4E68E2A9" wp14:editId="6247C78C">
+            <wp:extent cx="5400040" cy="3627755"/>
+            <wp:effectExtent l="0" t="0" r="0" b="0"/>
+            <wp:docPr id="2058538015" name="Imagem 1"/>
+            <wp:cNvGraphicFramePr>
+              <a:graphicFrameLocks xmlns:a="http://schemas.openxmlformats.org/drawingml/2006/main" noChangeAspect="1"/>
+            </wp:cNvGraphicFramePr>
+            <a:graphic xmlns:a="http://schemas.openxmlformats.org/drawingml/2006/main">
+              <a:graphicData uri="http://schemas.openxmlformats.org/drawingml/2006/picture">
+                <pic:pic xmlns:pic="http://schemas.openxmlformats.org/drawingml/2006/picture">
+                  <pic:nvPicPr>
+                    <pic:cNvPr id="2058538015" name=""/>
+                    <pic:cNvPicPr/>
+                  </pic:nvPicPr>
+                  <pic:blipFill>
+                    <a:blip r:embed="rId8"/>
+                    <a:stretch>
+                      <a:fillRect/>
+                    </a:stretch>
+                  </pic:blipFill>
+                  <pic:spPr>
+                    <a:xfrm>
+                      <a:off x="0" y="0"/>
+                      <a:ext cx="5400040" cy="3627755"/>
+                    </a:xfrm>
+                    <a:prstGeom prst="rect">
+                      <a:avLst/>
+                    </a:prstGeom>
+                  </pic:spPr>
+                </pic:pic>
+              </a:graphicData>
+            </a:graphic>
+          </wp:inline>
+        </w:drawing>
+      </w:r>
+    </w:p>
+    <w:p>
+      <w:pPr>
+        <w:rPr>
+          <w:color w:val="0D0D0D" w:themeColor="text1" w:themeTint="F2"/>
+        </w:rPr>
+      </w:pPr>
+      <w:r>
+        <w:rPr>
+          <w:color w:val="0D0D0D" w:themeColor="text1" w:themeTint="F2"/>
+        </w:rPr>
+        <w:drawing>
+          <wp:inline distT="0" distB="0" distL="0" distR="0" wp14:anchorId="5528DBF6" wp14:editId="2EAF6D5B">
+            <wp:extent cx="5400040" cy="3627755"/>
+            <wp:effectExtent l="0" t="0" r="0" b="0"/>
+            <wp:docPr id="1098961968" name="Imagem 1"/>
+            <wp:cNvGraphicFramePr>
+              <a:graphicFrameLocks xmlns:a="http://schemas.openxmlformats.org/drawingml/2006/main" noChangeAspect="1"/>
+            </wp:cNvGraphicFramePr>
+            <a:graphic xmlns:a="http://schemas.openxmlformats.org/drawingml/2006/main">
+              <a:graphicData uri="http://schemas.openxmlformats.org/drawingml/2006/picture">
+                <pic:pic xmlns:pic="http://schemas.openxmlformats.org/drawingml/2006/picture">
+                  <pic:nvPicPr>
+                    <pic:cNvPr id="1098961968" name=""/>
+                    <pic:cNvPicPr/>
+                  </pic:nvPicPr>
+                  <pic:blipFill>
+                    <a:blip r:embed="rId9"/>
+                    <a:stretch>
+                      <a:fillRect/>
+                    </a:stretch>
+                  </pic:blipFill>
+                  <pic:spPr>
+                    <a:xfrm>
+                      <a:off x="0" y="0"/>
+                      <a:ext cx="5400040" cy="3627755"/>
+                    </a:xfrm>
+                    <a:prstGeom prst="rect">
+                      <a:avLst/>
+                    </a:prstGeom>
+                  </pic:spPr>
+                </pic:pic>
+              </a:graphicData>
+            </a:graphic>
+          </wp:inline>
+        </w:drawing>
+      </w:r>
     </w:p>
     <w:sectPr>
       <w:pgSz w:w="11906" w:h="16838"/>
@@ -676,6 +938,119 @@
 <file path=word/numbering.xml><?xml version="1.0" encoding="utf-8"?>
 <w:numbering xmlns:wpc="http://schemas.microsoft.com/office/word/2010/wordprocessingCanvas" xmlns:cx="http://schemas.microsoft.com/office/drawing/2014/chartex" xmlns:cx1="http://schemas.microsoft.com/office/drawing/2015/9/8/chartex" xmlns:cx2="http://schemas.microsoft.com/office/drawing/2015/10/21/chartex" xmlns:cx3="http://schemas.microsoft.com/office/drawing/2016/5/9/chartex" xmlns:cx4="http://schemas.microsoft.com/office/drawing/2016/5/10/chartex" xmlns:cx5="http://schemas.microsoft.com/office/drawing/2016/5/11/chartex" xmlns:cx6="http://schemas.microsoft.com/office/drawing/2016/5/12/chartex" xmlns:cx7="http://schemas.microsoft.com/office/drawing/2016/5/13/chartex" xmlns:cx8="http://schemas.microsoft.com/office/drawing/2016/5/14/chartex" xmlns:mc="http://schemas.openxmlformats.org/markup-compatibility/2006" xmlns:aink="http://schemas.microsoft.com/office/drawing/2016/ink" xmlns:am3d="http://schemas.microsoft.com/office/drawing/2017/model3d" xmlns:o="urn:schemas-microsoft-com:office:office" xmlns:oel="http://schemas.microsoft.com/office/2019/extlst" xmlns:r="http://schemas.openxmlformats.org/officeDocument/2006/relationships" xmlns:m="http://schemas.openxmlformats.org/officeDocument/2006/math" xmlns:v="urn:schemas-microsoft-com:vml" xmlns:wp14="http://schemas.microsoft.com/office/word/2010/wordprocessingDrawing" xmlns:wp="http://schemas.openxmlformats.org/drawingml/2006/wordprocessingDrawing" xmlns:w10="urn:schemas-microsoft-com:office:word" xmlns:w="http://schemas.openxmlformats.org/wordprocessingml/2006/main" xmlns:w14="http://schemas.microsoft.com/office/word/2010/wordml" xmlns:w15="http://schemas.microsoft.com/office/word/2012/wordml" xmlns:w16cex="http://schemas.microsoft.com/office/word/2018/wordml/cex" xmlns:w16cid="http://schemas.microsoft.com/office/word/2016/wordml/cid" xmlns:w16="http://schemas.microsoft.com/office/word/2018/wordml" xmlns:w16du="http://schemas.microsoft.com/office/word/2023/wordml/word16du" xmlns:w16sdtdh="http://schemas.microsoft.com/office/word/2020/wordml/sdtdatahash" xmlns:w16sdtfl="http://schemas.microsoft.com/office/word/2024/wordml/sdtformatlock" xmlns:w16se="http://schemas.microsoft.com/office/word/2015/wordml/symex" xmlns:wpg="http://schemas.microsoft.com/office/word/2010/wordprocessingGroup" xmlns:wpi="http://schemas.microsoft.com/office/word/2010/wordprocessingInk" xmlns:wne="http://schemas.microsoft.com/office/word/2006/wordml" xmlns:wps="http://schemas.microsoft.com/office/word/2010/wordprocessingShape" mc:Ignorable="w14 w15 w16se w16cid w16 w16cex w16sdtdh w16sdtfl w16du wp14">
   <w:abstractNum w:abstractNumId="0" w15:restartNumberingAfterBreak="0">
+    <w:nsid w:val="7BFA6979"/>
+    <w:multiLevelType w:val="hybridMultilevel"/>
+    <w:tmpl w:val="45320F0E"/>
+    <w:lvl w:ilvl="0" w:tplc="04160001">
+      <w:start w:val="1"/>
+      <w:numFmt w:val="bullet"/>
+      <w:lvlText w:val=""/>
+      <w:lvlJc w:val="left"/>
+      <w:pPr>
+        <w:ind w:left="720" w:hanging="360"/>
+      </w:pPr>
+      <w:rPr>
+        <w:rFonts w:ascii="Symbol" w:hAnsi="Symbol" w:hint="default"/>
+      </w:rPr>
+    </w:lvl>
+    <w:lvl w:ilvl="1" w:tplc="04160003" w:tentative="1">
+      <w:start w:val="1"/>
+      <w:numFmt w:val="bullet"/>
+      <w:lvlText w:val="o"/>
+      <w:lvlJc w:val="left"/>
+      <w:pPr>
+        <w:ind w:left="1440" w:hanging="360"/>
+      </w:pPr>
+      <w:rPr>
+        <w:rFonts w:ascii="Courier New" w:hAnsi="Courier New" w:cs="Courier New" w:hint="default"/>
+      </w:rPr>
+    </w:lvl>
+    <w:lvl w:ilvl="2" w:tplc="04160005" w:tentative="1">
+      <w:start w:val="1"/>
+      <w:numFmt w:val="bullet"/>
+      <w:lvlText w:val=""/>
+      <w:lvlJc w:val="left"/>
+      <w:pPr>
+        <w:ind w:left="2160" w:hanging="360"/>
+      </w:pPr>
+      <w:rPr>
+        <w:rFonts w:ascii="Wingdings" w:hAnsi="Wingdings" w:hint="default"/>
+      </w:rPr>
+    </w:lvl>
+    <w:lvl w:ilvl="3" w:tplc="04160001" w:tentative="1">
+      <w:start w:val="1"/>
+      <w:numFmt w:val="bullet"/>
+      <w:lvlText w:val=""/>
+      <w:lvlJc w:val="left"/>
+      <w:pPr>
+        <w:ind w:left="2880" w:hanging="360"/>
+      </w:pPr>
+      <w:rPr>
+        <w:rFonts w:ascii="Symbol" w:hAnsi="Symbol" w:hint="default"/>
+      </w:rPr>
+    </w:lvl>
+    <w:lvl w:ilvl="4" w:tplc="04160003" w:tentative="1">
+      <w:start w:val="1"/>
+      <w:numFmt w:val="bullet"/>
+      <w:lvlText w:val="o"/>
+      <w:lvlJc w:val="left"/>
+      <w:pPr>
+        <w:ind w:left="3600" w:hanging="360"/>
+      </w:pPr>
+      <w:rPr>
+        <w:rFonts w:ascii="Courier New" w:hAnsi="Courier New" w:cs="Courier New" w:hint="default"/>
+      </w:rPr>
+    </w:lvl>
+    <w:lvl w:ilvl="5" w:tplc="04160005" w:tentative="1">
+      <w:start w:val="1"/>
+      <w:numFmt w:val="bullet"/>
+      <w:lvlText w:val=""/>
+      <w:lvlJc w:val="left"/>
+      <w:pPr>
+        <w:ind w:left="4320" w:hanging="360"/>
+      </w:pPr>
+      <w:rPr>
+        <w:rFonts w:ascii="Wingdings" w:hAnsi="Wingdings" w:hint="default"/>
+      </w:rPr>
+    </w:lvl>
+    <w:lvl w:ilvl="6" w:tplc="04160001" w:tentative="1">
+      <w:start w:val="1"/>
+      <w:numFmt w:val="bullet"/>
+      <w:lvlText w:val=""/>
+      <w:lvlJc w:val="left"/>
+      <w:pPr>
+        <w:ind w:left="5040" w:hanging="360"/>
+      </w:pPr>
+      <w:rPr>
+        <w:rFonts w:ascii="Symbol" w:hAnsi="Symbol" w:hint="default"/>
+      </w:rPr>
+    </w:lvl>
+    <w:lvl w:ilvl="7" w:tplc="04160003" w:tentative="1">
+      <w:start w:val="1"/>
+      <w:numFmt w:val="bullet"/>
+      <w:lvlText w:val="o"/>
+      <w:lvlJc w:val="left"/>
+      <w:pPr>
+        <w:ind w:left="5760" w:hanging="360"/>
+      </w:pPr>
+      <w:rPr>
+        <w:rFonts w:ascii="Courier New" w:hAnsi="Courier New" w:cs="Courier New" w:hint="default"/>
+      </w:rPr>
+    </w:lvl>
+    <w:lvl w:ilvl="8" w:tplc="04160005" w:tentative="1">
+      <w:start w:val="1"/>
+      <w:numFmt w:val="bullet"/>
+      <w:lvlText w:val=""/>
+      <w:lvlJc w:val="left"/>
+      <w:pPr>
+        <w:ind w:left="6480" w:hanging="360"/>
+      </w:pPr>
+      <w:rPr>
+        <w:rFonts w:ascii="Wingdings" w:hAnsi="Wingdings" w:hint="default"/>
+      </w:rPr>
+    </w:lvl>
+  </w:abstractNum>
+  <w:abstractNum w:abstractNumId="1" w15:restartNumberingAfterBreak="0">
     <w:nsid w:val="7E8337A6"/>
     <w:multiLevelType w:val="hybridMultilevel"/>
     <w:tmpl w:val="81CE47F2"/>
@@ -788,6 +1163,9 @@
     </w:lvl>
   </w:abstractNum>
   <w:num w:numId="1" w16cid:durableId="965358625">
+    <w:abstractNumId w:val="1"/>
+  </w:num>
+  <w:num w:numId="2" w16cid:durableId="1085611449">
     <w:abstractNumId w:val="0"/>
   </w:num>
 </w:numbering>
@@ -1395,6 +1773,7 @@
   <w:style w:type="character" w:default="1" w:styleId="Fontepargpadro">
     <w:name w:val="Default Paragraph Font"/>
     <w:uiPriority w:val="1"/>
+    <w:semiHidden/>
     <w:unhideWhenUsed/>
   </w:style>
   <w:style w:type="table" w:default="1" w:styleId="Tabelanormal">

</xml_diff>